<commit_message>
test: automate MVP customer journey
</commit_message>
<xml_diff>
--- a/OneStop_MVP_Architecture_v0.2.docx
+++ b/OneStop_MVP_Architecture_v0.2.docx
@@ -504,7 +504,7 @@
               <w:rPr>
                 <w:sz w:val="16"/>
               </w:rPr>
-              <w:t>CI complete; tracing, alerts, secrets and contract tests remain</w:t>
+              <w:t>CI and browser E2E complete; operations and deployment remain</w:t>
             </w:r>
           </w:p>
         </w:tc>
@@ -3095,6 +3095,43 @@
               <w:rPr>
                 <w:sz w:val="16"/>
               </w:rPr>
+              <w:t>Browser customer journey</w:t>
+            </w:r>
+          </w:p>
+        </w:tc>
+        <w:tc>
+          <w:tcPr>
+            <w:tcW w:type="dxa" w:w="5083"/>
+            <w:vAlign w:val="center"/>
+            <w:shd w:fill="F4F7FA"/>
+          </w:tcPr>
+          <w:p>
+            <w:pPr>
+              <w:spacing w:after="40"/>
+            </w:pPr>
+            <w:r>
+              <w:rPr>
+                <w:sz w:val="16"/>
+              </w:rPr>
+              <w:t>Playwright verifies register through cancellation and stock restoration</w:t>
+            </w:r>
+          </w:p>
+        </w:tc>
+      </w:tr>
+      <w:tr>
+        <w:tc>
+          <w:tcPr>
+            <w:tcW w:type="dxa" w:w="5083"/>
+            <w:vAlign w:val="center"/>
+          </w:tcPr>
+          <w:p>
+            <w:pPr>
+              <w:spacing w:after="40"/>
+            </w:pPr>
+            <w:r>
+              <w:rPr>
+                <w:sz w:val="16"/>
+              </w:rPr>
               <w:t>Order-service unit/integration tests</w:t>
             </w:r>
           </w:p>
@@ -3103,7 +3140,6 @@
           <w:tcPr>
             <w:tcW w:type="dxa" w:w="5083"/>
             <w:vAlign w:val="center"/>
-            <w:shd w:fill="F4F7FA"/>
           </w:tcPr>
           <w:p>
             <w:pPr>
@@ -3123,6 +3159,7 @@
           <w:tcPr>
             <w:tcW w:type="dxa" w:w="5083"/>
             <w:vAlign w:val="center"/>
+            <w:shd w:fill="F4F7FA"/>
           </w:tcPr>
           <w:p>
             <w:pPr>
@@ -3140,6 +3177,7 @@
           <w:tcPr>
             <w:tcW w:type="dxa" w:w="5083"/>
             <w:vAlign w:val="center"/>
+            <w:shd w:fill="F4F7FA"/>
           </w:tcPr>
           <w:p>
             <w:pPr>
@@ -3159,7 +3197,6 @@
           <w:tcPr>
             <w:tcW w:type="dxa" w:w="5083"/>
             <w:vAlign w:val="center"/>
-            <w:shd w:fill="F4F7FA"/>
           </w:tcPr>
           <w:p>
             <w:pPr>
@@ -3177,7 +3214,6 @@
           <w:tcPr>
             <w:tcW w:type="dxa" w:w="5083"/>
             <w:vAlign w:val="center"/>
-            <w:shd w:fill="F4F7FA"/>
           </w:tcPr>
           <w:p>
             <w:pPr>
@@ -3197,6 +3233,7 @@
           <w:tcPr>
             <w:tcW w:type="dxa" w:w="5083"/>
             <w:vAlign w:val="center"/>
+            <w:shd w:fill="F4F7FA"/>
           </w:tcPr>
           <w:p>
             <w:pPr>
@@ -3214,6 +3251,7 @@
           <w:tcPr>
             <w:tcW w:type="dxa" w:w="5083"/>
             <w:vAlign w:val="center"/>
+            <w:shd w:fill="F4F7FA"/>
           </w:tcPr>
           <w:p>
             <w:pPr>
@@ -3233,7 +3271,6 @@
           <w:tcPr>
             <w:tcW w:type="dxa" w:w="5083"/>
             <w:vAlign w:val="center"/>
-            <w:shd w:fill="F4F7FA"/>
           </w:tcPr>
           <w:p>
             <w:pPr>
@@ -3251,7 +3288,6 @@
           <w:tcPr>
             <w:tcW w:type="dxa" w:w="5083"/>
             <w:vAlign w:val="center"/>
-            <w:shd w:fill="F4F7FA"/>
           </w:tcPr>
           <w:p>
             <w:pPr>
@@ -3271,6 +3307,7 @@
           <w:tcPr>
             <w:tcW w:type="dxa" w:w="5083"/>
             <w:vAlign w:val="center"/>
+            <w:shd w:fill="F4F7FA"/>
           </w:tcPr>
           <w:p>
             <w:pPr>
@@ -3288,6 +3325,7 @@
           <w:tcPr>
             <w:tcW w:type="dxa" w:w="5083"/>
             <w:vAlign w:val="center"/>
+            <w:shd w:fill="F4F7FA"/>
           </w:tcPr>
           <w:p>
             <w:pPr>
@@ -3810,7 +3848,7 @@
               <w:rPr>
                 <w:sz w:val="16"/>
               </w:rPr>
-              <w:t>Outbox, consumer idempotency and CI complete</w:t>
+              <w:t>Outbox, idempotency, CI and browser E2E complete</w:t>
             </w:r>
           </w:p>
         </w:tc>
@@ -3925,7 +3963,7 @@
               <w:rPr>
                 <w:sz w:val="16"/>
               </w:rPr>
-              <w:t>Automate the full customer journey</w:t>
+              <w:t>Deploy a shared staging environment</w:t>
             </w:r>
           </w:p>
         </w:tc>
@@ -3943,7 +3981,7 @@
               <w:rPr>
                 <w:sz w:val="16"/>
               </w:rPr>
-              <w:t>Register-to-cancellation smoke test runs repeatably</w:t>
+              <w:t>Browser journey passes outside local Docker</w:t>
             </w:r>
           </w:p>
         </w:tc>

</xml_diff>